<commit_message>
docs(report): §11에 구성 판단 근거 표 신설 — Active/sqlite3/hybrid/이관대상의 대안 비교, delay 10s·OfflineBuffer 판단 명시
Co-Authored-By: Claude Fable 5 <noreply@anthropic.com>
</commit_message>
<xml_diff>
--- a/docs/결과보고서.docx
+++ b/docs/결과보고서.docx
@@ -7940,16 +7940,307 @@
         <w:t xml:space="preserve"> </w:t>
       </w:r>
       <w:r>
-        <w:t xml:space="preserve">compose에 프록시(</w:t>
-      </w:r>
-      <w:r>
-        <w:rPr>
-          <w:rStyle w:val="VerbatimChar"/>
-        </w:rPr>
-        <w:t xml:space="preserve">zabbix-proxy-sqlite3</w:t>
-      </w:r>
-      <w:r>
-        <w:t xml:space="preserve">, Active 모드, 7.0 신기능 hybrid 메모리 버퍼)를 profile 격리로 추가하고, API(</w:t>
+        <w:t xml:space="preserve">구성의 각 선택에는 기각한 대안이 있다.</w:t>
+      </w:r>
+    </w:p>
+    <w:tbl>
+      <w:tblPr>
+        <w:tblStyle w:val="Table"/>
+        <w:tblW w:type="pct" w:w="5000"/>
+        <w:tblLayout w:type="fixed"/>
+        <w:tblLook w:firstRow="1" w:lastRow="0" w:firstColumn="0" w:lastColumn="0" w:noHBand="0" w:noVBand="0" w:val="0020"/>
+      </w:tblPr>
+      <w:tblGrid>
+        <w:gridCol w:w="2640"/>
+        <w:gridCol w:w="2640"/>
+        <w:gridCol w:w="2640"/>
+      </w:tblGrid>
+      <w:tr>
+        <w:trPr>
+          <w:tblHeader w:val="on"/>
+        </w:trPr>
+        <w:tc>
+          <w:tcPr/>
+          <w:p>
+            <w:pPr>
+              <w:pStyle w:val="Compact"/>
+            </w:pPr>
+            <w:r>
+              <w:t xml:space="preserve">선택</w:t>
+            </w:r>
+          </w:p>
+        </w:tc>
+        <w:tc>
+          <w:tcPr/>
+          <w:p>
+            <w:pPr>
+              <w:pStyle w:val="Compact"/>
+            </w:pPr>
+            <w:r>
+              <w:t xml:space="preserve">고려한 대안</w:t>
+            </w:r>
+          </w:p>
+        </w:tc>
+        <w:tc>
+          <w:tcPr/>
+          <w:p>
+            <w:pPr>
+              <w:pStyle w:val="Compact"/>
+            </w:pPr>
+            <w:r>
+              <w:t xml:space="preserve">채택 근거</w:t>
+            </w:r>
+          </w:p>
+        </w:tc>
+      </w:tr>
+      <w:tr>
+        <w:tc>
+          <w:tcPr/>
+          <w:p>
+            <w:pPr>
+              <w:pStyle w:val="Compact"/>
+            </w:pPr>
+            <w:r>
+              <w:rPr>
+                <w:b/>
+                <w:bCs/>
+              </w:rPr>
+              <w:t xml:space="preserve">Active 모드</w:t>
+            </w:r>
+            <w:r>
+              <w:t xml:space="preserve">(</w:t>
+            </w:r>
+            <w:r>
+              <w:rPr>
+                <w:rStyle w:val="VerbatimChar"/>
+              </w:rPr>
+              <w:t xml:space="preserve">ProxyMode=0</w:t>
+            </w:r>
+            <w:r>
+              <w:t xml:space="preserve"> </w:t>
+            </w:r>
+            <w:r>
+              <w:t xml:space="preserve">— 프록시가 서버로 접속)</w:t>
+            </w:r>
+          </w:p>
+        </w:tc>
+        <w:tc>
+          <w:tcPr/>
+          <w:p>
+            <w:pPr>
+              <w:pStyle w:val="Compact"/>
+            </w:pPr>
+            <w:r>
+              <w:t xml:space="preserve">Passive(서버가 프록시를 폴링)</w:t>
+            </w:r>
+          </w:p>
+        </w:tc>
+        <w:tc>
+          <w:tcPr/>
+          <w:p>
+            <w:pPr>
+              <w:pStyle w:val="Compact"/>
+            </w:pPr>
+            <w:r>
+              <w:t xml:space="preserve">프록시의 실전 배치처(원격 POP·DMZ)는 인바운드를 열 수 없는 경우가 일반적이다. Active는 안→밖 단방향 TCP 1개(방화벽 규칙 1개)로 끝나고 서버 쪽에 프록시 주소 설정도 불필요 — 공식 문서가 명시한 실무 기본형</w:t>
+            </w:r>
+          </w:p>
+        </w:tc>
+      </w:tr>
+      <w:tr>
+        <w:tc>
+          <w:tcPr/>
+          <w:p>
+            <w:pPr>
+              <w:pStyle w:val="Compact"/>
+            </w:pPr>
+            <w:r>
+              <w:rPr>
+                <w:b/>
+                <w:bCs/>
+              </w:rPr>
+              <w:t xml:space="preserve">sqlite3 내장 빌드</w:t>
+            </w:r>
+          </w:p>
+        </w:tc>
+        <w:tc>
+          <w:tcPr/>
+          <w:p>
+            <w:pPr>
+              <w:pStyle w:val="Compact"/>
+            </w:pPr>
+            <w:r>
+              <w:t xml:space="preserve">proxy-mysql/pgsql(외부 DB 컨테이너)</w:t>
+            </w:r>
+          </w:p>
+        </w:tc>
+        <w:tc>
+          <w:tcPr/>
+          <w:p>
+            <w:pPr>
+              <w:pStyle w:val="Compact"/>
+            </w:pPr>
+            <w:r>
+              <w:t xml:space="preserve">“프록시 DB는 서버 DB와 반드시 분리(공유 시 구성 파손)”</w:t>
+            </w:r>
+            <w:r>
+              <w:t xml:space="preserve">라는 공식 경고가 있는데, 내장 sqlite는 이 함정을 구조적으로 제거한다. 데모 규모에서 외부 DB는 관리 대상만 늘린다</w:t>
+            </w:r>
+          </w:p>
+        </w:tc>
+      </w:tr>
+      <w:tr>
+        <w:tc>
+          <w:tcPr/>
+          <w:p>
+            <w:pPr>
+              <w:pStyle w:val="Compact"/>
+            </w:pPr>
+            <w:r>
+              <w:rPr>
+                <w:b/>
+                <w:bCs/>
+              </w:rPr>
+              <w:t xml:space="preserve">hybrid 버퍼</w:t>
+            </w:r>
+            <w:r>
+              <w:t xml:space="preserve"> </w:t>
+            </w:r>
+            <w:r>
+              <w:t xml:space="preserve">+</w:t>
+            </w:r>
+            <w:r>
+              <w:t xml:space="preserve"> </w:t>
+            </w:r>
+            <w:r>
+              <w:rPr>
+                <w:rStyle w:val="VerbatimChar"/>
+              </w:rPr>
+              <w:t xml:space="preserve">ProxyMemoryBufferSize=16M</w:t>
+            </w:r>
+          </w:p>
+        </w:tc>
+        <w:tc>
+          <w:tcPr/>
+          <w:p>
+            <w:pPr>
+              <w:pStyle w:val="Compact"/>
+            </w:pPr>
+            <w:r>
+              <w:t xml:space="preserve">disk(업그레이드 환경 기본) / memory 단독</w:t>
+            </w:r>
+          </w:p>
+        </w:tc>
+        <w:tc>
+          <w:tcPr/>
+          <w:p>
+            <w:pPr>
+              <w:pStyle w:val="Compact"/>
+            </w:pPr>
+            <w:r>
+              <w:t xml:space="preserve">평시 메모리 속도로 돌다가 셧다운·버퍼 초과 시 디스크로 flush — 속도와 유실 방어를 겸하며 7.0 신규 설치 권장값과 일치. memory 단독은 프록시 종료 시 버퍼가 폐기된다.</w:t>
+            </w:r>
+            <w:r>
+              <w:t xml:space="preserve"> </w:t>
+            </w:r>
+            <w:r>
+              <w:rPr>
+                <w:rStyle w:val="VerbatimChar"/>
+              </w:rPr>
+              <w:t xml:space="preserve">ProxyMemoryBufferAge</w:t>
+            </w:r>
+            <w:r>
+              <w:t xml:space="preserve">는 기본 0을 유지했다(시간 기준 디스크 전환 트리거인데, 실험 데이터량에선 발동 조건 자체가 성립하지 않아 파라미터만 늘어난다)</w:t>
+            </w:r>
+          </w:p>
+        </w:tc>
+      </w:tr>
+      <w:tr>
+        <w:tc>
+          <w:tcPr/>
+          <w:p>
+            <w:pPr>
+              <w:pStyle w:val="Compact"/>
+            </w:pPr>
+            <w:r>
+              <w:rPr>
+                <w:b/>
+                <w:bCs/>
+              </w:rPr>
+              <w:t xml:space="preserve">이관 대상 = nginx-sample</w:t>
+            </w:r>
+          </w:p>
+        </w:tc>
+        <w:tc>
+          <w:tcPr/>
+          <w:p>
+            <w:pPr>
+              <w:pStyle w:val="Compact"/>
+            </w:pPr>
+            <w:r>
+              <w:t xml:space="preserve">midibus 이관</w:t>
+            </w:r>
+          </w:p>
+        </w:tc>
+        <w:tc>
+          <w:tcPr/>
+          <w:p>
+            <w:pPr>
+              <w:pStyle w:val="Compact"/>
+            </w:pPr>
+            <w:r>
+              <w:t xml:space="preserve">검증 완료된 midibus 5-Step 파이프라인을 건드리는 것이 이 트랙의 최대 리스크였다. midibus는 서버 직접 감시로 남겨</w:t>
+            </w:r>
+            <w:r>
+              <w:t xml:space="preserve"> </w:t>
+            </w:r>
+            <w:r>
+              <w:rPr>
+                <w:b/>
+                <w:bCs/>
+              </w:rPr>
+              <w:t xml:space="preserve">같은 정전에서</w:t>
+            </w:r>
+            <w:r>
+              <w:rPr>
+                <w:b/>
+                <w:bCs/>
+              </w:rPr>
+              <w:t xml:space="preserve"> </w:t>
+            </w:r>
+            <w:r>
+              <w:rPr>
+                <w:b/>
+                <w:bCs/>
+              </w:rPr>
+              <w:t xml:space="preserve">“프록시 경유 vs 서버 직접”</w:t>
+            </w:r>
+            <w:r>
+              <w:rPr>
+                <w:b/>
+                <w:bCs/>
+              </w:rPr>
+              <w:t xml:space="preserve">의 대조군</w:t>
+            </w:r>
+            <w:r>
+              <w:t xml:space="preserve">으로 활용했고, 그 대비가 곧 E1의 증빙 그림이다</w:t>
+            </w:r>
+          </w:p>
+        </w:tc>
+      </w:tr>
+    </w:tbl>
+    <w:p>
+      <w:pPr>
+        <w:pStyle w:val="BodyText"/>
+      </w:pPr>
+      <w:r>
+        <w:rPr>
+          <w:rStyle w:val="VerbatimChar"/>
+        </w:rPr>
+        <w:t xml:space="preserve">ProxyOfflineBuffer</w:t>
+      </w:r>
+      <w:r>
+        <w:t xml:space="preserve">는 기본 1시간을 유지했다 — 실험 정전(6분)을 충분히 커버해 바꿀 이유가 없었다. 이렇게 compose에 프록시를 profile 격리로 추가하고, API(</w:t>
       </w:r>
       <w:r>
         <w:rPr>
@@ -8228,7 +8519,19 @@
         <w:t xml:space="preserve">docker kill</w:t>
       </w:r>
       <w:r>
-        <w:t xml:space="preserve">, failover delay 10s)는 16.6초 만에 standby가 승격했다(공식 산식</w:t>
+        <w:t xml:space="preserve">)는 16.6초 만에 standby가 승격했다(failover delay는 기본 60초를 공식 허용 최소값 10초로 조정 — 기본값 그대로면 시연 시간 안에 인계를 관측하기 어렵고, 이 조정 자체가 런타임 명령</w:t>
+      </w:r>
+      <w:r>
+        <w:t xml:space="preserve"> </w:t>
+      </w:r>
+      <w:r>
+        <w:rPr>
+          <w:rStyle w:val="VerbatimChar"/>
+        </w:rPr>
+        <w:t xml:space="preserve">ha_set_failover_delay</w:t>
+      </w:r>
+      <w:r>
+        <w:t xml:space="preserve">의 검증이다)(공식 산식</w:t>
       </w:r>
       <w:r>
         <w:t xml:space="preserve"> </w:t>

</xml_diff>